<commit_message>
Use simpler wording in the project documentation
Co-Authored-By: Claude Opus 5.5 <noreply@anthropic.com>
Claude-Session: https://claude.ai/code/session_01UuwcJpzuV1kCJLjx7dzR29
</commit_message>
<xml_diff>
--- a/documentation/IM102_Inventory_System_Documentation.docx
+++ b/documentation/IM102_Inventory_System_Documentation.docx
@@ -429,7 +429,7 @@
           <w:szCs w:val="24"/>
           <w:rtl w:val="0"/>
         </w:rPr>
-        <w:t xml:space="preserve">The Product Inventory System is a desktop application that helps a user keep track of the products in a small store or stockroom. It was made using Python, with Tkinter for the window and buttons and SQLite for saving the records. For each product, the system records the product ID, product name, category, quantity, and unit price.</w:t>
+        <w:t xml:space="preserve">The Product Inventory System is a desktop application that helps a user keep track of the products in a small store or stock room. It was made using Python, with Tkinter for the window and buttons and SQLite for saving the records. For each product, the system records the product ID, product name, category, quantity, and unit price.</w:t>
       </w:r>
     </w:p>
     <w:p>
@@ -449,7 +449,7 @@
           <w:szCs w:val="24"/>
           <w:rtl w:val="0"/>
         </w:rPr>
-        <w:t xml:space="preserve">The system has the basic inventory functions: adding a new product, viewing the saved products, searching, updating product details, and deleting products that are no longer needed. It also computes the total amount of each product and the total value of the whole inventory, and it warns the user when a product is running low. All records are saved in a database file named inventory.db, so the data is still there after the program is closed and opened again.</w:t>
+        <w:t xml:space="preserve">The system has the basic inventory functions: adding a new product, viewing the saved products, searching, updating product details, and deleting products that are no longer needed. It also gets the total amount of each product and the total value of all the products, and it tells the user when a product is running low. All records are saved in a database file named inventory.db, so the data is still there after the program is closed and opened again.</w:t>
       </w:r>
     </w:p>
     <w:p>
@@ -469,7 +469,7 @@
           <w:szCs w:val="24"/>
           <w:rtl w:val="0"/>
         </w:rPr>
-        <w:t xml:space="preserve">The system has a dark design with a light mode option. Everything is shown on one main screen, so the user can see the product table, the summary cards, and the product form at the same time without opening many windows.</w:t>
+        <w:t xml:space="preserve">The app uses a dark design, but it can also be switched to light mode. Everything is on one main screen, so the user can see the product table, the summary cards, and the product form at the same time without opening many windows.</w:t>
       </w:r>
     </w:p>
     <w:p>
@@ -634,7 +634,7 @@
           <w:szCs w:val="24"/>
           <w:rtl w:val="0"/>
         </w:rPr>
-        <w:t xml:space="preserve">To reduce mistakes in inventory by checking the user's input and computing the totals automatically.</w:t>
+        <w:t xml:space="preserve">To lessen mistakes by checking what the user types and getting the totals automatically.</w:t>
       </w:r>
     </w:p>
     <w:p>
@@ -1089,7 +1089,7 @@
           <w:szCs w:val="24"/>
           <w:rtl w:val="0"/>
         </w:rPr>
-        <w:t xml:space="preserve">Even though it provides the basic inventory functions, the Product Inventory System has some limitations:</w:t>
+        <w:t xml:space="preserve">The Product Inventory System can do the basic inventory tasks, but it also has some limitations:</w:t>
       </w:r>
     </w:p>
     <w:p>
@@ -1348,7 +1348,7 @@
           <w:szCs w:val="24"/>
           <w:rtl w:val="0"/>
         </w:rPr>
-        <w:t xml:space="preserve">Data Structures Used: When the app runs, the products from the database are loaded into a List of Dictionaries (self.products = []), where each dictionary is one product. The app also uses a List (self.log_entries = []) to keep the activity log of the current session, and a Tuple (CATEGORIES) for the default category choices. The total of each product is not saved in the database; it is computed as quantity × unit price.</w:t>
+        <w:t xml:space="preserve">Data Structures Used: When the app runs, the products from the database are loaded into a List of Dictionaries (self.products = []), where each dictionary is one product. The app also uses a List (self.log_entries = []) to keep the activity log of the current session, and a Tuple (CATEGORIES) for the default category choices. The total of each product is not saved in the database. It is solved every time as quantity × unit price.</w:t>
       </w:r>
     </w:p>
     <w:p>
@@ -7939,7 +7939,7 @@
           <w:sz w:val="24"/>
           <w:szCs w:val="24"/>
         </w:rPr>
-        <w:t xml:space="preserve">The group was able to build a working inventory system that can add, view, search, update, and delete product records. The records are saved in an SQLite database, so they are kept even after the app is closed. The system also checks the user's input before saving, computes the totals automatically, and warns the user about products that are low or out of stock. All the main tasks can be done on one screen, and the user can switch between dark mode and light mode.</w:t>
+        <w:t xml:space="preserve">The group built a working inventory system that can add, view, search, update, and delete product records. The records are saved in an SQLite database, so they are kept even after the app is closed. The system also checks what the user types before saving, gets the totals automatically, and shows which products are low or out of stock. All the main tasks can be done on one screen, and the user can switch between dark mode and light mode.</w:t>
       </w:r>
     </w:p>
     <w:p>
@@ -9327,7 +9327,7 @@
           <w:szCs w:val="24"/>
           <w:rtl w:val="0"/>
         </w:rPr>
-        <w:t xml:space="preserve">	Agile methodology focuses on a step-by-step way of building a system that works like a loop: the team works on small parts at a time, tests them, gets feedback, and then improves them. Agile values flexibility, teamwork, and constant improvement. It also makes it easier for the team to adjust when there are new requests or suggestions. Because of this, the team can make changes without wasting time or effort and keep the system useful for the people who will use it.</w:t>
+        <w:t xml:space="preserve">	Agile is a way of building a system step by step, like a loop. The team works on one small part at a time, tests it, asks for feedback, and then makes it better. With Agile, it is easy for the team to make changes when there are new requests or suggestions. Because of this, the team does not waste time redoing big parts, and the system stays useful for the people who will use it.</w:t>
       </w:r>
     </w:p>
     <w:p>
@@ -9757,7 +9757,7 @@
           <w:szCs w:val="24"/>
           <w:rtl w:val="0"/>
         </w:rPr>
-        <w:t xml:space="preserve">In this phase, the system was tested using the test cases in the Testing Evidence section to make sure that every function works and that wrong input does not crash the program.</w:t>
+        <w:t xml:space="preserve">In this phase, the group tested the system using the test cases in the Testing Evidence part. This was to make sure every function works and that wrong input does not make the program crash.</w:t>
       </w:r>
     </w:p>
     <w:p>
@@ -9852,7 +9852,7 @@
           <w:szCs w:val="24"/>
           <w:rtl w:val="0"/>
         </w:rPr>
-        <w:t xml:space="preserve">In this final phase, the system is reviewed to see if the objectives and features have been met, and to list what can be improved next.</w:t>
+        <w:t xml:space="preserve">In this last phase, the group checks if the objectives and features were met and lists what can still be improved.</w:t>
       </w:r>
     </w:p>
     <w:p>

</xml_diff>

<commit_message>
Add the cover date and contribution summary to the documentation
Co-Authored-By: Claude Opus 5.5 <noreply@anthropic.com>
Claude-Session: https://claude.ai/code/session_01UuwcJpzuV1kCJLjx7dzR29
</commit_message>
<xml_diff>
--- a/documentation/IM102_Inventory_System_Documentation.docx
+++ b/documentation/IM102_Inventory_System_Documentation.docx
@@ -316,7 +316,7 @@
           <w:szCs w:val="24"/>
           <w:rtl w:val="0"/>
         </w:rPr>
-        <w:t xml:space="preserve">DATE</w:t>
+        <w:t xml:space="preserve">October 29, 2026</w:t>
       </w:r>
     </w:p>
     <w:p>
@@ -8207,6 +8207,15 @@
         </w:rPr>
         <w:t xml:space="preserve">Menu Flow &amp; CRUD Core: </w:t>
       </w:r>
+      <w:r>
+        <w:rPr>
+          <w:rFonts w:ascii="Arial" w:cs="Arial" w:eastAsia="Arial" w:hAnsi="Arial"/>
+          <w:sz w:val="24"/>
+          <w:szCs w:val="24"/>
+          <w:rtl w:val="0"/>
+        </w:rPr>
+        <w:t xml:space="preserve">Mayo, Nathaniel B. – Made the main screen and the buttons for adding, viewing, searching, updating, and deleting products.</w:t>
+      </w:r>
     </w:p>
     <w:p>
       <w:pPr>
@@ -8274,6 +8283,15 @@
         </w:rPr>
         <w:t xml:space="preserve">Data Structures &amp; Database Handling: </w:t>
       </w:r>
+      <w:r>
+        <w:rPr>
+          <w:rFonts w:ascii="Arial" w:cs="Arial" w:eastAsia="Arial" w:hAnsi="Arial"/>
+          <w:sz w:val="24"/>
+          <w:szCs w:val="24"/>
+          <w:rtl w:val="0"/>
+        </w:rPr>
+        <w:t xml:space="preserve">Pader, Derick R. – Made the SQLite database and the products table, and the code that saves, loads, and changes the records.</w:t>
+      </w:r>
     </w:p>
     <w:p>
       <w:pPr>
@@ -8293,27 +8311,40 @@
     </w:p>
     <w:p>
       <w:pPr>
+        <w:widowControl w:val="0"/>
         <w:numPr>
           <w:ilvl w:val="0"/>
           <w:numId w:val="9"/>
         </w:numPr>
-        <w:spacing w:after="0" w:line="240" w:lineRule="auto"/>
-        <w:rPr>
-          <w:rFonts w:ascii="Times New Roman" w:cs="Times New Roman" w:eastAsia="Times New Roman" w:hAnsi="Times New Roman"/>
-          <w:color w:val="000000"/>
-          <w:sz w:val="24"/>
-          <w:szCs w:val="24"/>
-        </w:rPr>
-      </w:pPr>
-      <w:r>
-        <w:rPr>
-          <w:rFonts w:ascii="Times New Roman" w:cs="Times New Roman" w:eastAsia="Times New Roman" w:hAnsi="Times New Roman"/>
-          <w:color w:val="000000"/>
+        <w:spacing w:after="0" w:line="480" w:lineRule="auto"/>
+        <w:jc w:val="both"/>
+        <w:rPr>
+          <w:rFonts w:ascii="Arial" w:cs="Arial" w:eastAsia="Arial" w:hAnsi="Arial"/>
+          <w:b w:val="1"/>
+          <w:bCs w:val="1"/>
+          <w:sz w:val="24"/>
+          <w:szCs w:val="24"/>
+        </w:rPr>
+      </w:pPr>
+      <w:r>
+        <w:rPr>
+          <w:rFonts w:ascii="Arial" w:cs="Arial" w:eastAsia="Arial" w:hAnsi="Arial"/>
+          <w:b w:val="1"/>
+          <w:bCs w:val="1"/>
           <w:sz w:val="24"/>
           <w:szCs w:val="24"/>
           <w:rtl w:val="0"/>
         </w:rPr>
         <w:t xml:space="preserve">Exception Handling &amp; Documentation: </w:t>
+      </w:r>
+      <w:r>
+        <w:rPr>
+          <w:rFonts w:ascii="Arial" w:cs="Arial" w:eastAsia="Arial" w:hAnsi="Arial"/>
+          <w:sz w:val="24"/>
+          <w:szCs w:val="24"/>
+          <w:rtl w:val="0"/>
+        </w:rPr>
+        <w:t xml:space="preserve">Cantano, Chloe – Made the input checking and error messages, tested the system, and wrote the documentation.</w:t>
       </w:r>
     </w:p>
     <w:p>

</xml_diff>